<commit_message>
Update policies and documentation for Phase 1 finalisation
- Updated various policies including adoption, fostering, and GDPR-related documents.
- Added new policies for data breach response and record of processing activities.
- Revised roles and responsibilities register to reflect version 0.7.
- Created Phase 1 deliverables index and finalisation checklist to track compliance and approval processes.
- Ensured all documents are in the correct format and location for trustee review and publication.
</commit_message>
<xml_diff>
--- a/docs/forgotten-felines/published-policies/volunteer-policy.docx
+++ b/docs/forgotten-felines/published-policies/volunteer-policy.docx
@@ -355,11 +355,6 @@
       </w:tr>
     </w:tbl>
     <w:p/>
-    <w:p>
-      <w:pPr>
-        <w:spacing w:before="0" w:after="120"/>
-      </w:pPr>
-    </w:p>
     <w:p>
       <w:pPr>
         <w:spacing w:before="280" w:after="120"/>

</xml_diff>